<commit_message>
Regenera binarios do Kit com as correcoes (narrado + normas + ABNT + conservador)
Regenerados a partir dos geradores ja corrigidos e RE-TESTADOS:
- 4 ferramentas (LITE+PRO) e slides: sem Grupo VIP, calibragem conservadora
  (Defesa Civil 199/Bombeiros 193), edicoes de norma.
- 4 planilhas .xlsx: testadas (formulas lib) — 4/4 suites PASSARAM.
- 4 ferramentas .html: testadas (node vm) — 4/4 suites PASSARAM.
- 24 PDFs do Kit (apostila/checklist/guia-bolso/ebook/laudos) via Chromium headless.
- 4 fluxogramas .svg regenerados do .mmd (mermaid-cli) com edicoes de norma.
- 5 .docx (laudos/termos) regenerados.
- Apostilas com nota de direito autoral ABNT.

Co-Authored-By: Claude Opus 4.8 <noreply@anthropic.com>
Claude-Session: https://claude.ai/code/session_018F8nc2s9uRgxM8v4RubvM1
</commit_message>
<xml_diff>
--- a/escola-de-obra/02-curso-piloto/kit/relatorio/relatorio-blindado-fissuras.docx
+++ b/escola-de-obra/02-curso-piloto/kit/relatorio/relatorio-blindado-fissuras.docx
@@ -229,7 +229,7 @@
         <w:pStyle w:val="ListBullet"/>
       </w:pPr>
       <w:r>
-        <w:t>Inspeção do geral ao particular (contexto → detalhe), conforme boa prática de inspeção predial (NBR 16747).</w:t>
+        <w:t>Inspeção do geral ao particular (contexto → detalhe), conforme boa prática de inspeção predial (NBR 16747:2020).</w:t>
       </w:r>
     </w:p>
     <w:p>
@@ -265,7 +265,7 @@
         <w:t xml:space="preserve">Normas de referência: </w:t>
       </w:r>
       <w:r>
-        <w:t>NBR 6118 (estruturas de concreto), NBR 6122 (fundações), NBR 16747 (inspeção predial), NBR 13752 (perícias de engenharia). [Confirmar edição vigente na data.]</w:t>
+        <w:t>NBR 6118:2023 (estruturas de concreto), NBR 6122:2019 (fundações), NBR 16747:2020 (inspeção predial), NBR 13752:2024 (perícias de engenharia). [Confirmar edição vigente na data.]</w:t>
       </w:r>
     </w:p>
     <w:p>
@@ -883,7 +883,7 @@
           <w:i/>
           <w:color w:val="9C6500"/>
         </w:rPr>
-        <w:t>[ex.: recalque diferencial de fundação a investigar (NBR 6122)]</w:t>
+        <w:t>[ex.: recalque diferencial de fundação a investigar (NBR 6122:2019)]</w:t>
       </w:r>
     </w:p>
     <w:p>
@@ -899,7 +899,7 @@
           <w:i/>
           <w:color w:val="9C6500"/>
         </w:rPr>
-        <w:t>[ex.: umidade ascendente na base (NBR 9575)]</w:t>
+        <w:t>[ex.: umidade ascendente na base (NBR 9575:2010)]</w:t>
       </w:r>
     </w:p>
     <w:p>

</xml_diff>